<commit_message>
feat: file upload from UI working
</commit_message>
<xml_diff>
--- a/template2.docx
+++ b/template2.docx
@@ -305,6 +305,230 @@
       </w:pPr>
       <w:r>
         <w:rPr/>
+        <w:t xml:space="preserve">Basic: {data.lender.name} </w:t>
+      </w:r>
+    </w:p>
+    <w:p>
+      <w:pPr>
+        <w:pStyle w:val="Normal"/>
+        <w:bidi w:val="0"/>
+        <w:jc w:val="left"/>
+        <w:rPr/>
+      </w:pPr>
+      <w:r>
+        <w:rPr/>
+        <w:t>Test ifEqual: {data.lender.type|ifEqual('bank', '</w:t>
+      </w:r>
+      <w:r>
+        <w:rPr/>
+        <w:t>यो बैंक हो</w:t>
+      </w:r>
+      <w:r>
+        <w:rPr/>
+        <w:t>', '</w:t>
+      </w:r>
+      <w:r>
+        <w:rPr/>
+        <w:t>यो बैंक होइन</w:t>
+      </w:r>
+      <w:r>
+        <w:rPr/>
+        <w:t xml:space="preserve">')} Test switch: {data.lender.type|switch('bank', '🏦 </w:t>
+      </w:r>
+      <w:r>
+        <w:rPr/>
+        <w:t>बैंक</w:t>
+      </w:r>
+      <w:r>
+        <w:rPr/>
+        <w:t xml:space="preserve">', 'microfinance', '🏪 </w:t>
+      </w:r>
+      <w:r>
+        <w:rPr/>
+        <w:t>माइक्रो</w:t>
+      </w:r>
+      <w:r>
+        <w:rPr/>
+        <w:t xml:space="preserve">', '❓ </w:t>
+      </w:r>
+      <w:r>
+        <w:rPr/>
+        <w:t>अन्य</w:t>
+      </w:r>
+      <w:r>
+        <w:rPr/>
+        <w:t>')} Test ifBetween: {data.loan.principalAmount|ifBetween(1000000, 2000000, '</w:t>
+      </w:r>
+      <w:r>
+        <w:rPr/>
+        <w:t>मध्यम ऋण</w:t>
+      </w:r>
+      <w:r>
+        <w:rPr/>
+        <w:t>', '</w:t>
+      </w:r>
+      <w:r>
+        <w:rPr/>
+        <w:t>अन्य</w:t>
+      </w:r>
+      <w:r>
+        <w:rPr/>
+        <w:t>')}</w:t>
+      </w:r>
+    </w:p>
+    <w:p>
+      <w:pPr>
+        <w:pStyle w:val="Normal"/>
+        <w:bidi w:val="0"/>
+        <w:jc w:val="left"/>
+        <w:rPr/>
+      </w:pPr>
+      <w:r>
+        <w:rPr/>
+      </w:r>
+    </w:p>
+    <w:p>
+      <w:pPr>
+        <w:pStyle w:val="Normal"/>
+        <w:bidi w:val="0"/>
+        <w:jc w:val="left"/>
+        <w:rPr/>
+      </w:pPr>
+      <w:r>
+        <w:rPr/>
+      </w:r>
+    </w:p>
+    <w:p>
+      <w:pPr>
+        <w:pStyle w:val="Normal"/>
+        <w:widowControl/>
+        <w:bidi w:val="0"/>
+        <w:ind w:left="0" w:right="0" w:hanging="0"/>
+        <w:jc w:val="left"/>
+        <w:rPr/>
+      </w:pPr>
+      <w:r>
+        <w:rPr>
+          <w:rFonts w:ascii="jetbrains;jetbrains Fallback;Menlo;Monaco;monospace;monospace" w:hAnsi="jetbrains;jetbrains Fallback;Menlo;Monaco;monospace;monospace"/>
+          <w:b w:val="false"/>
+          <w:i w:val="false"/>
+          <w:caps w:val="false"/>
+          <w:smallCaps w:val="false"/>
+          <w:color w:val="383A42"/>
+          <w:spacing w:val="0"/>
+          <w:sz w:val="21"/>
+        </w:rPr>
+        <w:t>Bank Status: {data.lender.type|ifEqual('bank', '</w:t>
+      </w:r>
+      <w:r>
+        <w:rPr>
+          <w:rFonts w:cs="jetbrains;jetbrains Fallback;Menlo;Monaco;monospace;monospace"/>
+          <w:bCs w:val="false"/>
+          <w:iCs w:val="false"/>
+          <w:caps w:val="false"/>
+          <w:smallCaps w:val="false"/>
+          <w:color w:val="383A42"/>
+          <w:spacing w:val="0"/>
+          <w:szCs w:val="21"/>
+        </w:rPr>
+        <w:t>यो बैंक हो</w:t>
+      </w:r>
+      <w:r>
+        <w:rPr>
+          <w:rFonts w:ascii="jetbrains;jetbrains Fallback;Menlo;Monaco;monospace;monospace" w:hAnsi="jetbrains;jetbrains Fallback;Menlo;Monaco;monospace;monospace"/>
+          <w:b w:val="false"/>
+          <w:i w:val="false"/>
+          <w:caps w:val="false"/>
+          <w:smallCaps w:val="false"/>
+          <w:color w:val="383A42"/>
+          <w:spacing w:val="0"/>
+          <w:sz w:val="21"/>
+        </w:rPr>
+        <w:t>', '</w:t>
+      </w:r>
+      <w:r>
+        <w:rPr>
+          <w:rFonts w:cs="jetbrains;jetbrains Fallback;Menlo;Monaco;monospace;monospace"/>
+          <w:bCs w:val="false"/>
+          <w:iCs w:val="false"/>
+          <w:caps w:val="false"/>
+          <w:smallCaps w:val="false"/>
+          <w:color w:val="383A42"/>
+          <w:spacing w:val="0"/>
+          <w:szCs w:val="21"/>
+        </w:rPr>
+        <w:t>यो बैंक होइन</w:t>
+      </w:r>
+      <w:r>
+        <w:rPr>
+          <w:rFonts w:ascii="jetbrains;jetbrains Fallback;Menlo;Monaco;monospace;monospace" w:hAnsi="jetbrains;jetbrains Fallback;Menlo;Monaco;monospace;monospace"/>
+          <w:b w:val="false"/>
+          <w:i w:val="false"/>
+          <w:caps w:val="false"/>
+          <w:smallCaps w:val="false"/>
+          <w:color w:val="383A42"/>
+          <w:spacing w:val="0"/>
+          <w:sz w:val="21"/>
+        </w:rPr>
+        <w:t xml:space="preserve">')} </w:t>
+      </w:r>
+      <w:r>
+        <w:rPr/>
+        <w:br/>
+      </w:r>
+    </w:p>
+    <w:p>
+      <w:pPr>
+        <w:pStyle w:val="Normal"/>
+        <w:bidi w:val="0"/>
+        <w:jc w:val="left"/>
+        <w:rPr/>
+      </w:pPr>
+      <w:r>
+        <w:rPr/>
+      </w:r>
+    </w:p>
+    <w:p>
+      <w:pPr>
+        <w:pStyle w:val="Normal"/>
+        <w:bidi w:val="0"/>
+        <w:jc w:val="left"/>
+        <w:rPr/>
+      </w:pPr>
+      <w:r>
+        <w:rPr/>
+      </w:r>
+    </w:p>
+    <w:p>
+      <w:pPr>
+        <w:pStyle w:val="Normal"/>
+        <w:bidi w:val="0"/>
+        <w:jc w:val="left"/>
+        <w:rPr/>
+      </w:pPr>
+      <w:r>
+        <w:rPr/>
+        <w:t xml:space="preserve">{#if data.lender.type == "bank"} </w:t>
+      </w:r>
+    </w:p>
+    <w:p>
+      <w:pPr>
+        <w:pStyle w:val="Normal"/>
+        <w:bidi w:val="0"/>
+        <w:jc w:val="left"/>
+        <w:rPr/>
+      </w:pPr>
+      <w:r>
+        <w:rPr/>
+        <w:t xml:space="preserve">🏦 </w:t>
+      </w:r>
+      <w:r>
+        <w:rPr/>
+        <w:t xml:space="preserve">बैंकिङ संस्था </w:t>
+      </w:r>
+      <w:r>
+        <w:rPr/>
+        <w:t xml:space="preserve">(BANKING INSTITUTION) </w:t>
       </w:r>
     </w:p>
     <w:p>
@@ -320,71 +544,340 @@
       </w:r>
       <w:r>
         <w:rPr/>
-        <w:t>: {data.bank.nameNepali|bold}</w:t>
-      </w:r>
-    </w:p>
-    <w:p>
-      <w:pPr>
-        <w:pStyle w:val="Normal"/>
-        <w:bidi w:val="0"/>
-        <w:jc w:val="left"/>
-        <w:rPr/>
-      </w:pPr>
-      <w:r>
-        <w:rPr/>
-        <w:t>ठेगाना</w:t>
-      </w:r>
-      <w:r>
-        <w:rPr/>
-        <w:t>: {data.bank.address.nepali}</w:t>
-      </w:r>
-    </w:p>
-    <w:p>
-      <w:pPr>
-        <w:pStyle w:val="Normal"/>
-        <w:bidi w:val="0"/>
-        <w:jc w:val="left"/>
-        <w:rPr/>
-      </w:pPr>
-      <w:r>
-        <w:rPr/>
-        <w:t>सम्पर्क नम्बर</w:t>
-      </w:r>
-      <w:r>
-        <w:rPr/>
-        <w:t>: {data.bank.phone}</w:t>
-      </w:r>
-    </w:p>
-    <w:p>
-      <w:pPr>
-        <w:pStyle w:val="Normal"/>
-        <w:bidi w:val="0"/>
-        <w:jc w:val="left"/>
-        <w:rPr/>
-      </w:pPr>
-      <w:r>
-        <w:rPr/>
-        <w:t>इमेल</w:t>
-      </w:r>
-      <w:r>
-        <w:rPr/>
-        <w:t>: {data.bank.email}</w:t>
-      </w:r>
-    </w:p>
-    <w:p>
-      <w:pPr>
-        <w:pStyle w:val="Normal"/>
-        <w:bidi w:val="0"/>
-        <w:jc w:val="left"/>
-        <w:rPr/>
-      </w:pPr>
-      <w:r>
-        <w:rPr/>
-        <w:t>लाइसेन्स नम्बर</w:t>
-      </w:r>
-      <w:r>
-        <w:rPr/>
-        <w:t>: {data.bank.licenseNumber}</w:t>
+        <w:t xml:space="preserve">: {data.lender.name} </w:t>
+      </w:r>
+    </w:p>
+    <w:p>
+      <w:pPr>
+        <w:pStyle w:val="Normal"/>
+        <w:bidi w:val="0"/>
+        <w:jc w:val="left"/>
+        <w:rPr/>
+      </w:pPr>
+      <w:r>
+        <w:rPr/>
+        <w:t>लाइसेन्स नं</w:t>
+      </w:r>
+      <w:r>
+        <w:rPr/>
+        <w:t xml:space="preserve">: {data.lender.licenseNumber} </w:t>
+      </w:r>
+    </w:p>
+    <w:p>
+      <w:pPr>
+        <w:pStyle w:val="Normal"/>
+        <w:bidi w:val="0"/>
+        <w:jc w:val="left"/>
+        <w:rPr/>
+      </w:pPr>
+      <w:r>
+        <w:rPr/>
+        <w:t>{data.lender.regulatedBy|ifEqual('NRB', '</w:t>
+      </w:r>
+      <w:r>
+        <w:rPr/>
+        <w:t>नेपाल राष्ट्र बैंकको नियमनमा</w:t>
+      </w:r>
+      <w:r>
+        <w:rPr/>
+        <w:t>', '</w:t>
+      </w:r>
+      <w:r>
+        <w:rPr/>
+        <w:t>अन्य नियामक निकायको नियमनमा</w:t>
+      </w:r>
+      <w:r>
+        <w:rPr/>
+        <w:t xml:space="preserve">')} </w:t>
+      </w:r>
+    </w:p>
+    <w:p>
+      <w:pPr>
+        <w:pStyle w:val="Normal"/>
+        <w:bidi w:val="0"/>
+        <w:jc w:val="left"/>
+        <w:rPr/>
+      </w:pPr>
+      <w:r>
+        <w:rPr/>
+      </w:r>
+    </w:p>
+    <w:p>
+      <w:pPr>
+        <w:pStyle w:val="Normal"/>
+        <w:bidi w:val="0"/>
+        <w:jc w:val="left"/>
+        <w:rPr/>
+      </w:pPr>
+      <w:r>
+        <w:rPr/>
+        <w:t xml:space="preserve">{#elseif data.lender.type == "microfinance"} </w:t>
+      </w:r>
+    </w:p>
+    <w:p>
+      <w:pPr>
+        <w:pStyle w:val="Normal"/>
+        <w:bidi w:val="0"/>
+        <w:jc w:val="left"/>
+        <w:rPr/>
+      </w:pPr>
+      <w:r>
+        <w:rPr/>
+        <w:t xml:space="preserve">🏪 </w:t>
+      </w:r>
+      <w:r>
+        <w:rPr/>
+        <w:t xml:space="preserve">लघुवित्त संस्था </w:t>
+      </w:r>
+      <w:r>
+        <w:rPr/>
+        <w:t xml:space="preserve">(MICROFINANCE INSTITUTION) </w:t>
+      </w:r>
+    </w:p>
+    <w:p>
+      <w:pPr>
+        <w:pStyle w:val="Normal"/>
+        <w:bidi w:val="0"/>
+        <w:jc w:val="left"/>
+        <w:rPr/>
+      </w:pPr>
+      <w:r>
+        <w:rPr/>
+        <w:t>संस्थाको नाम</w:t>
+      </w:r>
+      <w:r>
+        <w:rPr/>
+        <w:t xml:space="preserve">: {data.lender.name} </w:t>
+      </w:r>
+    </w:p>
+    <w:p>
+      <w:pPr>
+        <w:pStyle w:val="Normal"/>
+        <w:bidi w:val="0"/>
+        <w:jc w:val="left"/>
+        <w:rPr/>
+      </w:pPr>
+      <w:r>
+        <w:rPr/>
+        <w:t>दर्ता नं</w:t>
+      </w:r>
+      <w:r>
+        <w:rPr/>
+        <w:t xml:space="preserve">: {data.lender.registrationNumber} </w:t>
+      </w:r>
+    </w:p>
+    <w:p>
+      <w:pPr>
+        <w:pStyle w:val="Normal"/>
+        <w:bidi w:val="0"/>
+        <w:jc w:val="left"/>
+        <w:rPr/>
+      </w:pPr>
+      <w:r>
+        <w:rPr/>
+        <w:t>{data.lender.category|switch('A', '</w:t>
+      </w:r>
+      <w:r>
+        <w:rPr/>
+        <w:t>राष्ट्रिय स्तरको</w:t>
+      </w:r>
+      <w:r>
+        <w:rPr/>
+        <w:t>', 'B', '</w:t>
+      </w:r>
+      <w:r>
+        <w:rPr/>
+        <w:t>प्रादेशिक स्तरको</w:t>
+      </w:r>
+      <w:r>
+        <w:rPr/>
+        <w:t>', 'C', '</w:t>
+      </w:r>
+      <w:r>
+        <w:rPr/>
+        <w:t>स्थानीय स्तरको</w:t>
+      </w:r>
+      <w:r>
+        <w:rPr/>
+        <w:t>', '</w:t>
+      </w:r>
+      <w:r>
+        <w:rPr/>
+        <w:t>सामान्य श्रेणी</w:t>
+      </w:r>
+      <w:r>
+        <w:rPr/>
+        <w:t xml:space="preserve">')} </w:t>
+      </w:r>
+    </w:p>
+    <w:p>
+      <w:pPr>
+        <w:pStyle w:val="Normal"/>
+        <w:bidi w:val="0"/>
+        <w:jc w:val="left"/>
+        <w:rPr/>
+      </w:pPr>
+      <w:r>
+        <w:rPr/>
+      </w:r>
+    </w:p>
+    <w:p>
+      <w:pPr>
+        <w:pStyle w:val="Normal"/>
+        <w:bidi w:val="0"/>
+        <w:jc w:val="left"/>
+        <w:rPr/>
+      </w:pPr>
+      <w:r>
+        <w:rPr/>
+        <w:t xml:space="preserve">{#elseif data.lender.type == "individual"} </w:t>
+      </w:r>
+    </w:p>
+    <w:p>
+      <w:pPr>
+        <w:pStyle w:val="Normal"/>
+        <w:bidi w:val="0"/>
+        <w:jc w:val="left"/>
+        <w:rPr/>
+      </w:pPr>
+      <w:r>
+        <w:rPr/>
+        <w:t xml:space="preserve">👤 </w:t>
+      </w:r>
+      <w:r>
+        <w:rPr/>
+        <w:t xml:space="preserve">व्यक्तिगत ऋणदाता </w:t>
+      </w:r>
+      <w:r>
+        <w:rPr/>
+        <w:t xml:space="preserve">(INDIVIDUAL LENDER) </w:t>
+      </w:r>
+    </w:p>
+    <w:p>
+      <w:pPr>
+        <w:pStyle w:val="Normal"/>
+        <w:bidi w:val="0"/>
+        <w:jc w:val="left"/>
+        <w:rPr/>
+      </w:pPr>
+      <w:r>
+        <w:rPr/>
+        <w:t>नाम</w:t>
+      </w:r>
+      <w:r>
+        <w:rPr/>
+        <w:t xml:space="preserve">: {data.lender.name|bold} </w:t>
+      </w:r>
+    </w:p>
+    <w:p>
+      <w:pPr>
+        <w:pStyle w:val="Normal"/>
+        <w:bidi w:val="0"/>
+        <w:jc w:val="left"/>
+        <w:rPr/>
+      </w:pPr>
+      <w:r>
+        <w:rPr/>
+        <w:t>नागरिकता नं</w:t>
+      </w:r>
+      <w:r>
+        <w:rPr/>
+        <w:t xml:space="preserve">: {data.lender.citizenshipNumber} </w:t>
+      </w:r>
+    </w:p>
+    <w:p>
+      <w:pPr>
+        <w:pStyle w:val="Normal"/>
+        <w:bidi w:val="0"/>
+        <w:jc w:val="left"/>
+        <w:rPr/>
+      </w:pPr>
+      <w:r>
+        <w:rPr/>
+        <w:t>{</w:t>
+      </w:r>
+      <w:r>
+        <w:rPr/>
+        <w:t>data.lender.guarantor|ifEmpty('', '</w:t>
+      </w:r>
+      <w:r>
+        <w:rPr/>
+        <w:t>जमानतकर्ता</w:t>
+      </w:r>
+      <w:r>
+        <w:rPr/>
+        <w:t xml:space="preserve">: ' + data.lender.guarantor)} </w:t>
+      </w:r>
+    </w:p>
+    <w:p>
+      <w:pPr>
+        <w:pStyle w:val="Normal"/>
+        <w:bidi w:val="0"/>
+        <w:jc w:val="left"/>
+        <w:rPr/>
+      </w:pPr>
+      <w:r>
+        <w:rPr/>
+      </w:r>
+    </w:p>
+    <w:p>
+      <w:pPr>
+        <w:pStyle w:val="Normal"/>
+        <w:bidi w:val="0"/>
+        <w:jc w:val="left"/>
+        <w:rPr/>
+      </w:pPr>
+      <w:r>
+        <w:rPr/>
+        <w:t xml:space="preserve">{#else} </w:t>
+      </w:r>
+    </w:p>
+    <w:p>
+      <w:pPr>
+        <w:pStyle w:val="Normal"/>
+        <w:bidi w:val="0"/>
+        <w:jc w:val="left"/>
+        <w:rPr/>
+      </w:pPr>
+      <w:r>
+        <w:rPr/>
+        <w:t xml:space="preserve">🏢 </w:t>
+      </w:r>
+      <w:r>
+        <w:rPr/>
+        <w:t xml:space="preserve">अन्य संस्था </w:t>
+      </w:r>
+      <w:r>
+        <w:rPr/>
+        <w:t xml:space="preserve">(OTHER INSTITUTION) </w:t>
+      </w:r>
+      <w:r>
+        <w:rPr/>
+        <w:t>नाम</w:t>
+      </w:r>
+      <w:r>
+        <w:rPr/>
+        <w:t xml:space="preserve">: {data.lender.name|bold} </w:t>
+      </w:r>
+      <w:r>
+        <w:rPr/>
+        <w:t>प्रकार</w:t>
+      </w:r>
+      <w:r>
+        <w:rPr/>
+        <w:t xml:space="preserve">: {data.lender.institutionType} </w:t>
+      </w:r>
+    </w:p>
+    <w:p>
+      <w:pPr>
+        <w:pStyle w:val="Normal"/>
+        <w:bidi w:val="0"/>
+        <w:jc w:val="left"/>
+        <w:rPr/>
+      </w:pPr>
+      <w:r>
+        <w:rPr/>
+        <w:t>{/if}</w:t>
       </w:r>
     </w:p>
     <w:p>
@@ -839,10 +1332,10 @@
       <w:tblGrid>
         <w:gridCol w:w="1606"/>
         <w:gridCol w:w="1606"/>
+        <w:gridCol w:w="1606"/>
         <w:gridCol w:w="1607"/>
         <w:gridCol w:w="1606"/>
         <w:gridCol w:w="1606"/>
-        <w:gridCol w:w="1607"/>
       </w:tblGrid>
       <w:tr>
         <w:trPr/>
@@ -858,6 +1351,7 @@
           <w:p>
             <w:pPr>
               <w:pStyle w:val="Normal"/>
+              <w:widowControl w:val="false"/>
               <w:bidi w:val="0"/>
               <w:jc w:val="left"/>
               <w:rPr/>
@@ -880,6 +1374,7 @@
           <w:p>
             <w:pPr>
               <w:pStyle w:val="Normal"/>
+              <w:widowControl w:val="false"/>
               <w:bidi w:val="0"/>
               <w:jc w:val="left"/>
               <w:rPr/>
@@ -896,7 +1391,7 @@
         </w:tc>
         <w:tc>
           <w:tcPr>
-            <w:tcW w:w="1607" w:type="dxa"/>
+            <w:tcW w:w="1606" w:type="dxa"/>
             <w:tcBorders>
               <w:top w:val="single" w:sz="4" w:space="0" w:color="000000"/>
               <w:left w:val="single" w:sz="4" w:space="0" w:color="000000"/>
@@ -906,6 +1401,7 @@
           <w:p>
             <w:pPr>
               <w:pStyle w:val="Normal"/>
+              <w:widowControl w:val="false"/>
               <w:bidi w:val="0"/>
               <w:jc w:val="left"/>
               <w:rPr/>
@@ -922,7 +1418,7 @@
         </w:tc>
         <w:tc>
           <w:tcPr>
-            <w:tcW w:w="1606" w:type="dxa"/>
+            <w:tcW w:w="1607" w:type="dxa"/>
             <w:tcBorders>
               <w:top w:val="single" w:sz="4" w:space="0" w:color="000000"/>
               <w:left w:val="single" w:sz="4" w:space="0" w:color="000000"/>
@@ -932,6 +1428,7 @@
           <w:p>
             <w:pPr>
               <w:pStyle w:val="Normal"/>
+              <w:widowControl w:val="false"/>
               <w:bidi w:val="0"/>
               <w:jc w:val="left"/>
               <w:rPr/>
@@ -958,6 +1455,7 @@
           <w:p>
             <w:pPr>
               <w:pStyle w:val="Normal"/>
+              <w:widowControl w:val="false"/>
               <w:bidi w:val="0"/>
               <w:jc w:val="left"/>
               <w:rPr/>
@@ -974,7 +1472,7 @@
         </w:tc>
         <w:tc>
           <w:tcPr>
-            <w:tcW w:w="1607" w:type="dxa"/>
+            <w:tcW w:w="1606" w:type="dxa"/>
             <w:tcBorders>
               <w:top w:val="single" w:sz="4" w:space="0" w:color="000000"/>
               <w:left w:val="single" w:sz="4" w:space="0" w:color="000000"/>
@@ -985,6 +1483,7 @@
           <w:p>
             <w:pPr>
               <w:pStyle w:val="Normal"/>
+              <w:widowControl w:val="false"/>
               <w:bidi w:val="0"/>
               <w:jc w:val="left"/>
               <w:rPr/>
@@ -1522,10 +2021,10 @@
       <w:tblGrid>
         <w:gridCol w:w="1606"/>
         <w:gridCol w:w="1606"/>
+        <w:gridCol w:w="1606"/>
         <w:gridCol w:w="1607"/>
         <w:gridCol w:w="1606"/>
         <w:gridCol w:w="1606"/>
-        <w:gridCol w:w="1607"/>
       </w:tblGrid>
       <w:tr>
         <w:trPr/>
@@ -1541,6 +2040,7 @@
           <w:p>
             <w:pPr>
               <w:pStyle w:val="Normal"/>
+              <w:widowControl w:val="false"/>
               <w:bidi w:val="0"/>
               <w:jc w:val="left"/>
               <w:rPr/>
@@ -1567,6 +2067,7 @@
           <w:p>
             <w:pPr>
               <w:pStyle w:val="Normal"/>
+              <w:widowControl w:val="false"/>
               <w:bidi w:val="0"/>
               <w:jc w:val="left"/>
               <w:rPr/>
@@ -1574,6 +2075,29 @@
             <w:r>
               <w:rPr/>
               <w:t>मिति</w:t>
+            </w:r>
+          </w:p>
+        </w:tc>
+        <w:tc>
+          <w:tcPr>
+            <w:tcW w:w="1606" w:type="dxa"/>
+            <w:tcBorders>
+              <w:top w:val="single" w:sz="4" w:space="0" w:color="000000"/>
+              <w:left w:val="single" w:sz="4" w:space="0" w:color="000000"/>
+              <w:bottom w:val="single" w:sz="4" w:space="0" w:color="000000"/>
+            </w:tcBorders>
+          </w:tcPr>
+          <w:p>
+            <w:pPr>
+              <w:pStyle w:val="Normal"/>
+              <w:widowControl w:val="false"/>
+              <w:bidi w:val="0"/>
+              <w:jc w:val="left"/>
+              <w:rPr/>
+            </w:pPr>
+            <w:r>
+              <w:rPr/>
+              <w:t>मूलधन</w:t>
             </w:r>
           </w:p>
         </w:tc>
@@ -1589,28 +2113,7 @@
           <w:p>
             <w:pPr>
               <w:pStyle w:val="Normal"/>
-              <w:bidi w:val="0"/>
-              <w:jc w:val="left"/>
-              <w:rPr/>
-            </w:pPr>
-            <w:r>
-              <w:rPr/>
-              <w:t>मूलधन</w:t>
-            </w:r>
-          </w:p>
-        </w:tc>
-        <w:tc>
-          <w:tcPr>
-            <w:tcW w:w="1606" w:type="dxa"/>
-            <w:tcBorders>
-              <w:top w:val="single" w:sz="4" w:space="0" w:color="000000"/>
-              <w:left w:val="single" w:sz="4" w:space="0" w:color="000000"/>
-              <w:bottom w:val="single" w:sz="4" w:space="0" w:color="000000"/>
-            </w:tcBorders>
-          </w:tcPr>
-          <w:p>
-            <w:pPr>
-              <w:pStyle w:val="Normal"/>
+              <w:widowControl w:val="false"/>
               <w:bidi w:val="0"/>
               <w:jc w:val="left"/>
               <w:rPr/>
@@ -1633,6 +2136,7 @@
           <w:p>
             <w:pPr>
               <w:pStyle w:val="Normal"/>
+              <w:widowControl w:val="false"/>
               <w:bidi w:val="0"/>
               <w:jc w:val="left"/>
               <w:rPr/>
@@ -1649,7 +2153,7 @@
         </w:tc>
         <w:tc>
           <w:tcPr>
-            <w:tcW w:w="1607" w:type="dxa"/>
+            <w:tcW w:w="1606" w:type="dxa"/>
             <w:tcBorders>
               <w:top w:val="single" w:sz="4" w:space="0" w:color="000000"/>
               <w:left w:val="single" w:sz="4" w:space="0" w:color="000000"/>
@@ -1660,6 +2164,7 @@
           <w:p>
             <w:pPr>
               <w:pStyle w:val="Normal"/>
+              <w:widowControl w:val="false"/>
               <w:bidi w:val="0"/>
               <w:jc w:val="left"/>
               <w:rPr/>
@@ -1684,6 +2189,7 @@
           <w:p>
             <w:pPr>
               <w:pStyle w:val="Normal"/>
+              <w:widowControl w:val="false"/>
               <w:bidi w:val="0"/>
               <w:jc w:val="left"/>
               <w:rPr/>
@@ -1705,6 +2211,7 @@
           <w:p>
             <w:pPr>
               <w:pStyle w:val="Normal"/>
+              <w:widowControl w:val="false"/>
               <w:bidi w:val="0"/>
               <w:jc w:val="left"/>
               <w:rPr/>
@@ -1717,7 +2224,7 @@
         </w:tc>
         <w:tc>
           <w:tcPr>
-            <w:tcW w:w="1607" w:type="dxa"/>
+            <w:tcW w:w="1606" w:type="dxa"/>
             <w:tcBorders>
               <w:left w:val="single" w:sz="4" w:space="0" w:color="000000"/>
               <w:bottom w:val="single" w:sz="4" w:space="0" w:color="000000"/>
@@ -1726,7 +2233,7 @@
           <w:p>
             <w:pPr>
               <w:pStyle w:val="TableContents"/>
-              <w:widowControl/>
+              <w:widowControl w:val="false"/>
               <w:bidi w:val="0"/>
               <w:ind w:left="0" w:right="0" w:hanging="0"/>
               <w:jc w:val="left"/>
@@ -1793,7 +2300,7 @@
         </w:tc>
         <w:tc>
           <w:tcPr>
-            <w:tcW w:w="1606" w:type="dxa"/>
+            <w:tcW w:w="1607" w:type="dxa"/>
             <w:tcBorders>
               <w:left w:val="single" w:sz="4" w:space="0" w:color="000000"/>
               <w:bottom w:val="single" w:sz="4" w:space="0" w:color="000000"/>
@@ -1802,7 +2309,7 @@
           <w:p>
             <w:pPr>
               <w:pStyle w:val="TableContents"/>
-              <w:widowControl/>
+              <w:widowControl w:val="false"/>
               <w:bidi w:val="0"/>
               <w:ind w:left="0" w:right="0" w:hanging="0"/>
               <w:jc w:val="left"/>
@@ -1878,7 +2385,7 @@
           <w:p>
             <w:pPr>
               <w:pStyle w:val="TableContents"/>
-              <w:widowControl/>
+              <w:widowControl w:val="false"/>
               <w:bidi w:val="0"/>
               <w:ind w:left="0" w:right="0" w:hanging="0"/>
               <w:jc w:val="left"/>
@@ -1945,7 +2452,7 @@
         </w:tc>
         <w:tc>
           <w:tcPr>
-            <w:tcW w:w="1607" w:type="dxa"/>
+            <w:tcW w:w="1606" w:type="dxa"/>
             <w:tcBorders>
               <w:left w:val="single" w:sz="4" w:space="0" w:color="000000"/>
               <w:bottom w:val="single" w:sz="4" w:space="0" w:color="000000"/>
@@ -1955,7 +2462,7 @@
           <w:p>
             <w:pPr>
               <w:pStyle w:val="TableContents"/>
-              <w:widowControl/>
+              <w:widowControl w:val="false"/>
               <w:bidi w:val="0"/>
               <w:ind w:left="0" w:right="0" w:hanging="0"/>
               <w:jc w:val="left"/>
@@ -4085,6 +4592,7 @@
       <w:pgNumType w:fmt="decimal"/>
       <w:formProt w:val="false"/>
       <w:textDirection w:val="lrTb"/>
+      <w:docGrid w:type="default" w:linePitch="100" w:charSpace="0"/>
     </w:sectPr>
   </w:body>
 </w:document>
@@ -4104,7 +4612,6 @@
     </w:rPrDefault>
     <w:pPrDefault>
       <w:pPr>
-        <w:widowControl/>
         <w:suppressAutoHyphens w:val="true"/>
       </w:pPr>
     </w:pPrDefault>
@@ -4114,7 +4621,10 @@
     <w:qFormat/>
     <w:pPr>
       <w:widowControl/>
+      <w:suppressAutoHyphens w:val="true"/>
       <w:bidi w:val="0"/>
+      <w:spacing w:before="0" w:after="0"/>
+      <w:jc w:val="left"/>
     </w:pPr>
     <w:rPr>
       <w:rFonts w:ascii="Liberation Serif" w:hAnsi="Liberation Serif" w:eastAsia="Noto Serif CJK SC" w:cs="Lohit Devanagari"/>

</xml_diff>